<commit_message>
feat: placeholders and docx edit
</commit_message>
<xml_diff>
--- a/format/md-22/03_Device_Classification_Justification_Template.docx
+++ b/format/md-22/03_Device_Classification_Justification_Template.docx
@@ -4,460 +4,468 @@
   <w:body>
     <w:p>
       <w:pPr>
-        <w:keepNext/>
-        <w:keepLines w:val="0"/>
-        <w:spacing w:before="0" w:after="60" w:line="252" w:lineRule="auto"/>
+        <w:spacing w:before="0" w:after="20" w:line="259" w:lineRule="auto"/>
         <w:jc w:val="center"/>
       </w:pPr>
       <w:r>
         <w:rPr>
-          <w:rFonts w:ascii="Times New Roman" w:hAnsi="Times New Roman" w:cs="Times New Roman"/>
+          <w:rFonts w:ascii="Times New Roman" w:hAnsi="Times New Roman" w:eastAsia="Times New Roman"/>
           <w:b/>
           <w:i w:val="0"/>
-          <w:vanish w:val="0"/>
-          <w:color w:val="000000"/>
-          <w:sz w:val="32"/>
+          <w:sz w:val="26"/>
         </w:rPr>
         <w:t>DEVICE CLASSIFICATION JUSTIFICATION</w:t>
       </w:r>
     </w:p>
     <w:p>
       <w:pPr>
-        <w:keepNext/>
-        <w:keepLines w:val="0"/>
-        <w:spacing w:before="0" w:after="240" w:line="252" w:lineRule="auto"/>
+        <w:spacing w:before="0" w:after="100" w:line="259" w:lineRule="auto"/>
         <w:jc w:val="center"/>
       </w:pPr>
       <w:r>
         <w:rPr>
-          <w:rFonts w:ascii="Times New Roman" w:hAnsi="Times New Roman" w:cs="Times New Roman"/>
+          <w:rFonts w:ascii="Times New Roman" w:hAnsi="Times New Roman" w:eastAsia="Times New Roman"/>
           <w:b w:val="0"/>
           <w:i w:val="0"/>
-          <w:vanish w:val="0"/>
-          <w:color w:val="000000"/>
-          <w:sz w:val="22"/>
+          <w:sz w:val="21"/>
         </w:rPr>
         <w:t>Form MD-22 - Investigational Medical Device</w:t>
       </w:r>
     </w:p>
+    <w:p>
+      <w:pPr>
+        <w:spacing w:before="0" w:after="0" w:line="259" w:lineRule="auto"/>
+      </w:pPr>
+      <w:r>
+        <w:rPr>
+          <w:rFonts w:ascii="Times New Roman" w:hAnsi="Times New Roman" w:eastAsia="Times New Roman"/>
+          <w:b w:val="0"/>
+          <w:i w:val="0"/>
+          <w:sz w:val="22"/>
+        </w:rPr>
+        <w:t>To,</w:t>
+      </w:r>
+    </w:p>
+    <w:p>
+      <w:pPr>
+        <w:spacing w:before="0" w:after="40" w:line="259" w:lineRule="auto"/>
+      </w:pPr>
+      <w:r>
+        <w:rPr>
+          <w:rFonts w:ascii="Times New Roman" w:hAnsi="Times New Roman" w:eastAsia="Times New Roman"/>
+          <w:b w:val="0"/>
+          <w:i w:val="0"/>
+          <w:sz w:val="22"/>
+        </w:rPr>
+        <w:t>{applicationDate}</w:t>
+      </w:r>
+    </w:p>
+    <w:p>
+      <w:pPr>
+        <w:spacing w:before="0" w:after="0" w:line="259" w:lineRule="auto"/>
+      </w:pPr>
+      <w:r>
+        <w:rPr>
+          <w:rFonts w:ascii="Times New Roman" w:hAnsi="Times New Roman" w:eastAsia="Times New Roman"/>
+          <w:b/>
+          <w:i w:val="0"/>
+          <w:sz w:val="22"/>
+        </w:rPr>
+        <w:t>The Drug Controller General of India</w:t>
+      </w:r>
+    </w:p>
+    <w:p>
+      <w:pPr>
+        <w:spacing w:before="0" w:after="0" w:line="259" w:lineRule="auto"/>
+      </w:pPr>
+      <w:r>
+        <w:rPr>
+          <w:rFonts w:ascii="Times New Roman" w:hAnsi="Times New Roman" w:eastAsia="Times New Roman"/>
+          <w:b/>
+          <w:i w:val="0"/>
+          <w:sz w:val="22"/>
+        </w:rPr>
+        <w:t>CDSCO</w:t>
+      </w:r>
+    </w:p>
+    <w:p>
+      <w:pPr>
+        <w:spacing w:before="0" w:after="0" w:line="259" w:lineRule="auto"/>
+      </w:pPr>
+      <w:r>
+        <w:rPr>
+          <w:rFonts w:ascii="Times New Roman" w:hAnsi="Times New Roman" w:eastAsia="Times New Roman"/>
+          <w:b w:val="0"/>
+          <w:i w:val="0"/>
+          <w:sz w:val="22"/>
+        </w:rPr>
+        <w:t>FDA Bhavan, ITO, Kotla Road,</w:t>
+      </w:r>
+    </w:p>
+    <w:p>
+      <w:pPr>
+        <w:spacing w:before="0" w:after="0" w:line="259" w:lineRule="auto"/>
+      </w:pPr>
+      <w:r>
+        <w:rPr>
+          <w:rFonts w:ascii="Times New Roman" w:hAnsi="Times New Roman" w:eastAsia="Times New Roman"/>
+          <w:b w:val="0"/>
+          <w:i w:val="0"/>
+          <w:sz w:val="22"/>
+        </w:rPr>
+        <w:t>New Delhi: -110002</w:t>
+      </w:r>
+    </w:p>
+    <w:p>
+      <w:pPr>
+        <w:spacing w:before="0" w:after="100" w:line="259" w:lineRule="auto"/>
+      </w:pPr>
+      <w:r>
+        <w:rPr>
+          <w:rFonts w:ascii="Times New Roman" w:hAnsi="Times New Roman" w:eastAsia="Times New Roman"/>
+          <w:b w:val="0"/>
+          <w:i w:val="0"/>
+          <w:sz w:val="22"/>
+        </w:rPr>
+        <w:t>India</w:t>
+      </w:r>
+    </w:p>
+    <w:p>
+      <w:pPr>
+        <w:spacing w:before="0" w:after="100" w:line="259" w:lineRule="auto"/>
+      </w:pPr>
+      <w:r>
+        <w:rPr>
+          <w:rFonts w:ascii="Times New Roman" w:hAnsi="Times New Roman" w:eastAsia="Times New Roman"/>
+          <w:b/>
+          <w:i w:val="0"/>
+          <w:sz w:val="22"/>
+        </w:rPr>
+        <w:t>Sub: - Device Classification Justification</w:t>
+      </w:r>
+    </w:p>
+    <w:p>
+      <w:pPr>
+        <w:spacing w:before="0" w:after="80" w:line="259" w:lineRule="auto"/>
+      </w:pPr>
+      <w:r>
+        <w:rPr>
+          <w:rFonts w:ascii="Times New Roman" w:hAnsi="Times New Roman" w:eastAsia="Times New Roman"/>
+          <w:b w:val="0"/>
+          <w:i w:val="0"/>
+          <w:sz w:val="22"/>
+        </w:rPr>
+        <w:t>Dear Sir,</w:t>
+      </w:r>
+    </w:p>
+    <w:p>
+      <w:pPr>
+        <w:spacing w:before="0" w:after="120" w:line="259" w:lineRule="auto"/>
+      </w:pPr>
+      <w:r>
+        <w:rPr>
+          <w:rFonts w:ascii="Times New Roman" w:hAnsi="Times New Roman" w:eastAsia="Times New Roman"/>
+          <w:b w:val="0"/>
+          <w:i w:val="0"/>
+          <w:sz w:val="22"/>
+        </w:rPr>
+        <w:t>Device Classification Justification for the proposed investigational medical device(s) submitted under Form MD-22. The details of the device(s), intended use, classification rule and supporting rationale are provided below for your kind consideration.</w:t>
+      </w:r>
+    </w:p>
     <w:tbl>
       <w:tblPr>
-        <w:tblW w:type="dxa" w:w="8906"/>
-        <w:jc w:val="left"/>
+        <w:tblW w:type="auto" w:w="0"/>
+        <w:jc w:val="center"/>
         <w:tblLayout w:type="fixed"/>
         <w:tblLook w:firstColumn="1" w:firstRow="1" w:lastColumn="0" w:lastRow="0" w:noHBand="0" w:noVBand="1" w:val="04A0"/>
-        <w:tblInd w:w="110" w:type="dxa"/>
+        <w:tblBorders>
+          <w:top w:val="single" w:sz="6" w:space="0" w:color="777777"/>
+          <w:left w:val="single" w:sz="6" w:space="0" w:color="777777"/>
+          <w:bottom w:val="single" w:sz="6" w:space="0" w:color="777777"/>
+          <w:right w:val="single" w:sz="6" w:space="0" w:color="777777"/>
+          <w:insideH w:val="single" w:sz="6" w:space="0" w:color="777777"/>
+          <w:insideV w:val="single" w:sz="6" w:space="0" w:color="777777"/>
+        </w:tblBorders>
+        <w:tblLayout w:type="fixed"/>
       </w:tblPr>
       <w:tblGrid>
-        <w:gridCol w:w="2300"/>
-        <w:gridCol w:w="6606"/>
+        <w:gridCol w:w="1776"/>
+        <w:gridCol w:w="1776"/>
+        <w:gridCol w:w="1776"/>
+        <w:gridCol w:w="1776"/>
+        <w:gridCol w:w="1776"/>
+        <w:gridCol w:w="1776"/>
       </w:tblGrid>
       <w:tr>
-        <w:trPr>
-          <w:cantSplit w:val="true"/>
-        </w:trPr>
         <w:tc>
           <w:tcPr>
-            <w:tcW w:type="dxa" w:w="2300"/>
-            <w:tcMar>
-              <w:top w:w="90" w:type="dxa"/>
-              <w:start w:w="110" w:type="dxa"/>
-              <w:bottom w:w="90" w:type="dxa"/>
-              <w:end w:w="110" w:type="dxa"/>
-            </w:tcMar>
-            <w:tcBorders>
-              <w:top w:val="single" w:sz="6" w:space="0" w:color="808080"/>
-              <w:start w:val="single" w:sz="6" w:space="0" w:color="808080"/>
-              <w:bottom w:val="single" w:sz="6" w:space="0" w:color="808080"/>
-              <w:end w:val="single" w:sz="6" w:space="0" w:color="808080"/>
-              <w:insideH w:val="single" w:sz="6" w:space="0" w:color="808080"/>
-              <w:insideV w:val="single" w:sz="6" w:space="0" w:color="808080"/>
-            </w:tcBorders>
+            <w:tcW w:type="dxa" w:w="792"/>
             <w:vAlign w:val="center"/>
-            <w:shd w:val="clear" w:color="auto" w:fill="F2F2F2"/>
+            <w:shd w:fill="EAEAEA"/>
           </w:tcPr>
           <w:p>
             <w:pPr>
-              <w:spacing w:before="0" w:after="0" w:line="252" w:lineRule="auto"/>
+              <w:spacing w:after="0" w:line="240" w:lineRule="auto"/>
+              <w:jc w:val="center"/>
+            </w:pPr>
+            <w:r/>
+            <w:r>
+              <w:rPr>
+                <w:rFonts w:ascii="Times New Roman" w:hAnsi="Times New Roman" w:eastAsia="Times New Roman"/>
+                <w:b/>
+                <w:i w:val="0"/>
+                <w:sz w:val="17"/>
+              </w:rPr>
+              <w:t>S.N.</w:t>
+            </w:r>
+          </w:p>
+        </w:tc>
+        <w:tc>
+          <w:tcPr>
+            <w:tcW w:type="dxa" w:w="2808"/>
+            <w:vAlign w:val="center"/>
+            <w:shd w:fill="EAEAEA"/>
+          </w:tcPr>
+          <w:p>
+            <w:pPr>
+              <w:spacing w:after="0" w:line="240" w:lineRule="auto"/>
+              <w:jc w:val="center"/>
+            </w:pPr>
+            <w:r/>
+            <w:r>
+              <w:rPr>
+                <w:rFonts w:ascii="Times New Roman" w:hAnsi="Times New Roman" w:eastAsia="Times New Roman"/>
+                <w:b/>
+                <w:i w:val="0"/>
+                <w:sz w:val="17"/>
+              </w:rPr>
+              <w:t>Name of the Medical Device</w:t>
+            </w:r>
+          </w:p>
+        </w:tc>
+        <w:tc>
+          <w:tcPr>
+            <w:tcW w:type="dxa" w:w="2088"/>
+            <w:vAlign w:val="center"/>
+            <w:shd w:fill="EAEAEA"/>
+          </w:tcPr>
+          <w:p>
+            <w:pPr>
+              <w:spacing w:after="0" w:line="240" w:lineRule="auto"/>
+              <w:jc w:val="center"/>
+            </w:pPr>
+            <w:r/>
+            <w:r>
+              <w:rPr>
+                <w:rFonts w:ascii="Times New Roman" w:hAnsi="Times New Roman" w:eastAsia="Times New Roman"/>
+                <w:b/>
+                <w:i w:val="0"/>
+                <w:sz w:val="17"/>
+              </w:rPr>
+              <w:t>Device Model / Type</w:t>
+            </w:r>
+          </w:p>
+        </w:tc>
+        <w:tc>
+          <w:tcPr>
+            <w:tcW w:type="dxa" w:w="2952"/>
+            <w:vAlign w:val="center"/>
+            <w:shd w:fill="EAEAEA"/>
+          </w:tcPr>
+          <w:p>
+            <w:pPr>
+              <w:spacing w:after="0" w:line="240" w:lineRule="auto"/>
+              <w:jc w:val="center"/>
+            </w:pPr>
+            <w:r/>
+            <w:r>
+              <w:rPr>
+                <w:rFonts w:ascii="Times New Roman" w:hAnsi="Times New Roman" w:eastAsia="Times New Roman"/>
+                <w:b/>
+                <w:i w:val="0"/>
+                <w:sz w:val="17"/>
+              </w:rPr>
+              <w:t>Intended Use</w:t>
+            </w:r>
+          </w:p>
+        </w:tc>
+        <w:tc>
+          <w:tcPr>
+            <w:tcW w:type="dxa" w:w="2952"/>
+            <w:vAlign w:val="center"/>
+            <w:shd w:fill="EAEAEA"/>
+          </w:tcPr>
+          <w:p>
+            <w:pPr>
+              <w:spacing w:after="0" w:line="240" w:lineRule="auto"/>
+              <w:jc w:val="center"/>
+            </w:pPr>
+            <w:r/>
+            <w:r>
+              <w:rPr>
+                <w:rFonts w:ascii="Times New Roman" w:hAnsi="Times New Roman" w:eastAsia="Times New Roman"/>
+                <w:b/>
+                <w:i w:val="0"/>
+                <w:sz w:val="17"/>
+              </w:rPr>
+              <w:t>Applicable Classification Rule</w:t>
+            </w:r>
+          </w:p>
+        </w:tc>
+        <w:tc>
+          <w:tcPr>
+            <w:tcW w:type="dxa" w:w="1368"/>
+            <w:vAlign w:val="center"/>
+            <w:shd w:fill="EAEAEA"/>
+          </w:tcPr>
+          <w:p>
+            <w:pPr>
+              <w:spacing w:after="0" w:line="240" w:lineRule="auto"/>
+              <w:jc w:val="center"/>
+            </w:pPr>
+            <w:r/>
+            <w:r>
+              <w:rPr>
+                <w:rFonts w:ascii="Times New Roman" w:hAnsi="Times New Roman" w:eastAsia="Times New Roman"/>
+                <w:b/>
+                <w:i w:val="0"/>
+                <w:sz w:val="17"/>
+              </w:rPr>
+              <w:t>Proposed Class</w:t>
+            </w:r>
+          </w:p>
+        </w:tc>
+      </w:tr>
+      <w:tr>
+        <w:tc>
+          <w:tcPr>
+            <w:tcW w:type="dxa" w:w="792"/>
+            <w:vAlign w:val="center"/>
+          </w:tcPr>
+          <w:p>
+            <w:pPr>
+              <w:spacing w:after="0" w:line="240" w:lineRule="auto"/>
               <w:jc w:val="left"/>
             </w:pPr>
             <w:r/>
             <w:r>
               <w:rPr>
-                <w:rFonts w:ascii="Times New Roman" w:hAnsi="Times New Roman" w:cs="Times New Roman"/>
-                <w:b/>
+                <w:rFonts w:ascii="Times New Roman" w:hAnsi="Times New Roman" w:eastAsia="Times New Roman"/>
+                <w:b w:val="0"/>
                 <w:i w:val="0"/>
-                <w:vanish w:val="0"/>
-                <w:color w:val="000000"/>
-                <w:sz w:val="18"/>
+                <w:sz w:val="17"/>
               </w:rPr>
-              <w:t>Applicant / Sponsor</w:t>
+              <w:t>{#devices}{slNo}</w:t>
             </w:r>
           </w:p>
         </w:tc>
         <w:tc>
           <w:tcPr>
-            <w:tcW w:type="dxa" w:w="6606"/>
-            <w:tcMar>
-              <w:top w:w="90" w:type="dxa"/>
-              <w:start w:w="110" w:type="dxa"/>
-              <w:bottom w:w="90" w:type="dxa"/>
-              <w:end w:w="110" w:type="dxa"/>
-            </w:tcMar>
-            <w:tcBorders>
-              <w:top w:val="single" w:sz="6" w:space="0" w:color="808080"/>
-              <w:start w:val="single" w:sz="6" w:space="0" w:color="808080"/>
-              <w:bottom w:val="single" w:sz="6" w:space="0" w:color="808080"/>
-              <w:end w:val="single" w:sz="6" w:space="0" w:color="808080"/>
-              <w:insideH w:val="single" w:sz="6" w:space="0" w:color="808080"/>
-              <w:insideV w:val="single" w:sz="6" w:space="0" w:color="808080"/>
-            </w:tcBorders>
+            <w:tcW w:type="dxa" w:w="2808"/>
             <w:vAlign w:val="center"/>
           </w:tcPr>
           <w:p>
             <w:pPr>
-              <w:spacing w:before="0" w:after="0" w:line="252" w:lineRule="auto"/>
+              <w:spacing w:after="0" w:line="240" w:lineRule="auto"/>
               <w:jc w:val="left"/>
             </w:pPr>
             <w:r/>
             <w:r>
               <w:rPr>
-                <w:rFonts w:ascii="Times New Roman" w:hAnsi="Times New Roman" w:cs="Times New Roman"/>
+                <w:rFonts w:ascii="Times New Roman" w:hAnsi="Times New Roman" w:eastAsia="Times New Roman"/>
                 <w:b w:val="0"/>
                 <w:i w:val="0"/>
-                <w:vanish w:val="0"/>
-                <w:color w:val="000000"/>
-                <w:sz w:val="18"/>
+                <w:sz w:val="17"/>
               </w:rPr>
-              <w:t>{applicantName}</w:t>
+              <w:t>{deviceGenericName}</w:t>
             </w:r>
           </w:p>
         </w:tc>
-      </w:tr>
-      <w:tr>
-        <w:trPr>
-          <w:cantSplit w:val="true"/>
-        </w:trPr>
         <w:tc>
           <w:tcPr>
-            <w:tcW w:type="dxa" w:w="2300"/>
-            <w:tcMar>
-              <w:top w:w="90" w:type="dxa"/>
-              <w:start w:w="110" w:type="dxa"/>
-              <w:bottom w:w="90" w:type="dxa"/>
-              <w:end w:w="110" w:type="dxa"/>
-            </w:tcMar>
-            <w:tcBorders>
-              <w:top w:val="single" w:sz="6" w:space="0" w:color="808080"/>
-              <w:start w:val="single" w:sz="6" w:space="0" w:color="808080"/>
-              <w:bottom w:val="single" w:sz="6" w:space="0" w:color="808080"/>
-              <w:end w:val="single" w:sz="6" w:space="0" w:color="808080"/>
-              <w:insideH w:val="single" w:sz="6" w:space="0" w:color="808080"/>
-              <w:insideV w:val="single" w:sz="6" w:space="0" w:color="808080"/>
-            </w:tcBorders>
+            <w:tcW w:type="dxa" w:w="2088"/>
             <w:vAlign w:val="center"/>
-            <w:shd w:val="clear" w:color="auto" w:fill="F2F2F2"/>
           </w:tcPr>
           <w:p>
             <w:pPr>
-              <w:spacing w:before="0" w:after="0" w:line="252" w:lineRule="auto"/>
+              <w:spacing w:after="0" w:line="240" w:lineRule="auto"/>
               <w:jc w:val="left"/>
             </w:pPr>
             <w:r/>
             <w:r>
               <w:rPr>
-                <w:rFonts w:ascii="Times New Roman" w:hAnsi="Times New Roman" w:cs="Times New Roman"/>
-                <w:b/>
+                <w:rFonts w:ascii="Times New Roman" w:hAnsi="Times New Roman" w:eastAsia="Times New Roman"/>
+                <w:b w:val="0"/>
                 <w:i w:val="0"/>
-                <w:vanish w:val="0"/>
-                <w:color w:val="000000"/>
-                <w:sz w:val="18"/>
+                <w:sz w:val="17"/>
               </w:rPr>
-              <w:t>Device</w:t>
+              <w:t>{deviceModelOrType}</w:t>
             </w:r>
           </w:p>
         </w:tc>
         <w:tc>
           <w:tcPr>
-            <w:tcW w:type="dxa" w:w="6606"/>
-            <w:tcMar>
-              <w:top w:w="90" w:type="dxa"/>
-              <w:start w:w="110" w:type="dxa"/>
-              <w:bottom w:w="90" w:type="dxa"/>
-              <w:end w:w="110" w:type="dxa"/>
-            </w:tcMar>
-            <w:tcBorders>
-              <w:top w:val="single" w:sz="6" w:space="0" w:color="808080"/>
-              <w:start w:val="single" w:sz="6" w:space="0" w:color="808080"/>
-              <w:bottom w:val="single" w:sz="6" w:space="0" w:color="808080"/>
-              <w:end w:val="single" w:sz="6" w:space="0" w:color="808080"/>
-              <w:insideH w:val="single" w:sz="6" w:space="0" w:color="808080"/>
-              <w:insideV w:val="single" w:sz="6" w:space="0" w:color="808080"/>
-            </w:tcBorders>
+            <w:tcW w:type="dxa" w:w="2952"/>
             <w:vAlign w:val="center"/>
           </w:tcPr>
           <w:p>
             <w:pPr>
-              <w:spacing w:before="0" w:after="0" w:line="252" w:lineRule="auto"/>
+              <w:spacing w:after="0" w:line="240" w:lineRule="auto"/>
               <w:jc w:val="left"/>
             </w:pPr>
             <w:r/>
             <w:r>
               <w:rPr>
-                <w:rFonts w:ascii="Times New Roman" w:hAnsi="Times New Roman" w:cs="Times New Roman"/>
+                <w:rFonts w:ascii="Times New Roman" w:hAnsi="Times New Roman" w:eastAsia="Times New Roman"/>
                 <w:b w:val="0"/>
                 <w:i w:val="0"/>
-                <w:vanish w:val="0"/>
-                <w:color w:val="000000"/>
-                <w:sz w:val="18"/>
+                <w:sz w:val="17"/>
               </w:rPr>
-              <w:t>{deviceGenericName} | {deviceModelOrType}</w:t>
+              <w:t>{intendedUse}</w:t>
             </w:r>
           </w:p>
         </w:tc>
-      </w:tr>
-      <w:tr>
-        <w:trPr>
-          <w:cantSplit w:val="true"/>
-        </w:trPr>
         <w:tc>
           <w:tcPr>
-            <w:tcW w:type="dxa" w:w="2300"/>
-            <w:tcMar>
-              <w:top w:w="90" w:type="dxa"/>
-              <w:start w:w="110" w:type="dxa"/>
-              <w:bottom w:w="90" w:type="dxa"/>
-              <w:end w:w="110" w:type="dxa"/>
-            </w:tcMar>
-            <w:tcBorders>
-              <w:top w:val="single" w:sz="6" w:space="0" w:color="808080"/>
-              <w:start w:val="single" w:sz="6" w:space="0" w:color="808080"/>
-              <w:bottom w:val="single" w:sz="6" w:space="0" w:color="808080"/>
-              <w:end w:val="single" w:sz="6" w:space="0" w:color="808080"/>
-              <w:insideH w:val="single" w:sz="6" w:space="0" w:color="808080"/>
-              <w:insideV w:val="single" w:sz="6" w:space="0" w:color="808080"/>
-            </w:tcBorders>
+            <w:tcW w:type="dxa" w:w="2952"/>
             <w:vAlign w:val="center"/>
-            <w:shd w:val="clear" w:color="auto" w:fill="F2F2F2"/>
           </w:tcPr>
           <w:p>
             <w:pPr>
-              <w:spacing w:before="0" w:after="0" w:line="252" w:lineRule="auto"/>
+              <w:spacing w:after="0" w:line="240" w:lineRule="auto"/>
               <w:jc w:val="left"/>
             </w:pPr>
             <w:r/>
             <w:r>
               <w:rPr>
-                <w:rFonts w:ascii="Times New Roman" w:hAnsi="Times New Roman" w:cs="Times New Roman"/>
-                <w:b/>
+                <w:rFonts w:ascii="Times New Roman" w:hAnsi="Times New Roman" w:eastAsia="Times New Roman"/>
+                <w:b w:val="0"/>
                 <w:i w:val="0"/>
-                <w:vanish w:val="0"/>
-                <w:color w:val="000000"/>
-                <w:sz w:val="18"/>
+                <w:sz w:val="17"/>
               </w:rPr>
-              <w:t>Intended use</w:t>
+              <w:t>{applicableClassificationRule}</w:t>
             </w:r>
           </w:p>
         </w:tc>
         <w:tc>
           <w:tcPr>
-            <w:tcW w:type="dxa" w:w="6606"/>
-            <w:tcMar>
-              <w:top w:w="90" w:type="dxa"/>
-              <w:start w:w="110" w:type="dxa"/>
-              <w:bottom w:w="90" w:type="dxa"/>
-              <w:end w:w="110" w:type="dxa"/>
-            </w:tcMar>
-            <w:tcBorders>
-              <w:top w:val="single" w:sz="6" w:space="0" w:color="808080"/>
-              <w:start w:val="single" w:sz="6" w:space="0" w:color="808080"/>
-              <w:bottom w:val="single" w:sz="6" w:space="0" w:color="808080"/>
-              <w:end w:val="single" w:sz="6" w:space="0" w:color="808080"/>
-              <w:insideH w:val="single" w:sz="6" w:space="0" w:color="808080"/>
-              <w:insideV w:val="single" w:sz="6" w:space="0" w:color="808080"/>
-            </w:tcBorders>
+            <w:tcW w:type="dxa" w:w="1368"/>
             <w:vAlign w:val="center"/>
           </w:tcPr>
           <w:p>
             <w:pPr>
-              <w:spacing w:before="0" w:after="0" w:line="252" w:lineRule="auto"/>
+              <w:spacing w:after="0" w:line="240" w:lineRule="auto"/>
               <w:jc w:val="left"/>
             </w:pPr>
             <w:r/>
             <w:r>
               <w:rPr>
-                <w:rFonts w:ascii="Times New Roman" w:hAnsi="Times New Roman" w:cs="Times New Roman"/>
+                <w:rFonts w:ascii="Times New Roman" w:hAnsi="Times New Roman" w:eastAsia="Times New Roman"/>
                 <w:b w:val="0"/>
                 <w:i w:val="0"/>
-                <w:vanish w:val="0"/>
-                <w:color w:val="000000"/>
-                <w:sz w:val="18"/>
+                <w:sz w:val="17"/>
               </w:rPr>
-              <w:t>{intendedUse}</w:t>
-            </w:r>
-          </w:p>
-        </w:tc>
-      </w:tr>
-      <w:tr>
-        <w:trPr>
-          <w:cantSplit w:val="true"/>
-        </w:trPr>
-        <w:tc>
-          <w:tcPr>
-            <w:tcW w:type="dxa" w:w="2300"/>
-            <w:tcMar>
-              <w:top w:w="90" w:type="dxa"/>
-              <w:start w:w="110" w:type="dxa"/>
-              <w:bottom w:w="90" w:type="dxa"/>
-              <w:end w:w="110" w:type="dxa"/>
-            </w:tcMar>
-            <w:tcBorders>
-              <w:top w:val="single" w:sz="6" w:space="0" w:color="808080"/>
-              <w:start w:val="single" w:sz="6" w:space="0" w:color="808080"/>
-              <w:bottom w:val="single" w:sz="6" w:space="0" w:color="808080"/>
-              <w:end w:val="single" w:sz="6" w:space="0" w:color="808080"/>
-              <w:insideH w:val="single" w:sz="6" w:space="0" w:color="808080"/>
-              <w:insideV w:val="single" w:sz="6" w:space="0" w:color="808080"/>
-            </w:tcBorders>
-            <w:vAlign w:val="center"/>
-            <w:shd w:val="clear" w:color="auto" w:fill="F2F2F2"/>
-          </w:tcPr>
-          <w:p>
-            <w:pPr>
-              <w:spacing w:before="0" w:after="0" w:line="252" w:lineRule="auto"/>
-              <w:jc w:val="left"/>
-            </w:pPr>
-            <w:r/>
-            <w:r>
-              <w:rPr>
-                <w:rFonts w:ascii="Times New Roman" w:hAnsi="Times New Roman" w:cs="Times New Roman"/>
-                <w:b/>
-                <w:i w:val="0"/>
-                <w:vanish w:val="0"/>
-                <w:color w:val="000000"/>
-                <w:sz w:val="18"/>
-              </w:rPr>
-              <w:t>Proposed class</w:t>
-            </w:r>
-          </w:p>
-        </w:tc>
-        <w:tc>
-          <w:tcPr>
-            <w:tcW w:type="dxa" w:w="6606"/>
-            <w:tcMar>
-              <w:top w:w="90" w:type="dxa"/>
-              <w:start w:w="110" w:type="dxa"/>
-              <w:bottom w:w="90" w:type="dxa"/>
-              <w:end w:w="110" w:type="dxa"/>
-            </w:tcMar>
-            <w:tcBorders>
-              <w:top w:val="single" w:sz="6" w:space="0" w:color="808080"/>
-              <w:start w:val="single" w:sz="6" w:space="0" w:color="808080"/>
-              <w:bottom w:val="single" w:sz="6" w:space="0" w:color="808080"/>
-              <w:end w:val="single" w:sz="6" w:space="0" w:color="808080"/>
-              <w:insideH w:val="single" w:sz="6" w:space="0" w:color="808080"/>
-              <w:insideV w:val="single" w:sz="6" w:space="0" w:color="808080"/>
-            </w:tcBorders>
-            <w:vAlign w:val="center"/>
-          </w:tcPr>
-          <w:p>
-            <w:pPr>
-              <w:spacing w:before="0" w:after="0" w:line="252" w:lineRule="auto"/>
-              <w:jc w:val="left"/>
-            </w:pPr>
-            <w:r/>
-            <w:r>
-              <w:rPr>
-                <w:rFonts w:ascii="Times New Roman" w:hAnsi="Times New Roman" w:cs="Times New Roman"/>
-                <w:b w:val="0"/>
-                <w:i w:val="0"/>
-                <w:vanish w:val="0"/>
-                <w:color w:val="000000"/>
-                <w:sz w:val="18"/>
-              </w:rPr>
-              <w:t>Class {deviceClass}</w:t>
-            </w:r>
-          </w:p>
-        </w:tc>
-      </w:tr>
-      <w:tr>
-        <w:trPr>
-          <w:cantSplit w:val="true"/>
-        </w:trPr>
-        <w:tc>
-          <w:tcPr>
-            <w:tcW w:type="dxa" w:w="2300"/>
-            <w:tcMar>
-              <w:top w:w="90" w:type="dxa"/>
-              <w:start w:w="110" w:type="dxa"/>
-              <w:bottom w:w="90" w:type="dxa"/>
-              <w:end w:w="110" w:type="dxa"/>
-            </w:tcMar>
-            <w:tcBorders>
-              <w:top w:val="single" w:sz="6" w:space="0" w:color="808080"/>
-              <w:start w:val="single" w:sz="6" w:space="0" w:color="808080"/>
-              <w:bottom w:val="single" w:sz="6" w:space="0" w:color="808080"/>
-              <w:end w:val="single" w:sz="6" w:space="0" w:color="808080"/>
-              <w:insideH w:val="single" w:sz="6" w:space="0" w:color="808080"/>
-              <w:insideV w:val="single" w:sz="6" w:space="0" w:color="808080"/>
-            </w:tcBorders>
-            <w:vAlign w:val="center"/>
-            <w:shd w:val="clear" w:color="auto" w:fill="F2F2F2"/>
-          </w:tcPr>
-          <w:p>
-            <w:pPr>
-              <w:spacing w:before="0" w:after="0" w:line="252" w:lineRule="auto"/>
-              <w:jc w:val="left"/>
-            </w:pPr>
-            <w:r/>
-            <w:r>
-              <w:rPr>
-                <w:rFonts w:ascii="Times New Roman" w:hAnsi="Times New Roman" w:cs="Times New Roman"/>
-                <w:b/>
-                <w:i w:val="0"/>
-                <w:vanish w:val="0"/>
-                <w:color w:val="000000"/>
-                <w:sz w:val="18"/>
-              </w:rPr>
-              <w:t>Document date</w:t>
-            </w:r>
-          </w:p>
-        </w:tc>
-        <w:tc>
-          <w:tcPr>
-            <w:tcW w:type="dxa" w:w="6606"/>
-            <w:tcMar>
-              <w:top w:w="90" w:type="dxa"/>
-              <w:start w:w="110" w:type="dxa"/>
-              <w:bottom w:w="90" w:type="dxa"/>
-              <w:end w:w="110" w:type="dxa"/>
-            </w:tcMar>
-            <w:tcBorders>
-              <w:top w:val="single" w:sz="6" w:space="0" w:color="808080"/>
-              <w:start w:val="single" w:sz="6" w:space="0" w:color="808080"/>
-              <w:bottom w:val="single" w:sz="6" w:space="0" w:color="808080"/>
-              <w:end w:val="single" w:sz="6" w:space="0" w:color="808080"/>
-              <w:insideH w:val="single" w:sz="6" w:space="0" w:color="808080"/>
-              <w:insideV w:val="single" w:sz="6" w:space="0" w:color="808080"/>
-            </w:tcBorders>
-            <w:vAlign w:val="center"/>
-          </w:tcPr>
-          <w:p>
-            <w:pPr>
-              <w:spacing w:before="0" w:after="0" w:line="252" w:lineRule="auto"/>
-              <w:jc w:val="left"/>
-            </w:pPr>
-            <w:r/>
-            <w:r>
-              <w:rPr>
-                <w:rFonts w:ascii="Times New Roman" w:hAnsi="Times New Roman" w:cs="Times New Roman"/>
-                <w:b w:val="0"/>
-                <w:i w:val="0"/>
-                <w:vanish w:val="0"/>
-                <w:color w:val="000000"/>
-                <w:sz w:val="18"/>
-              </w:rPr>
-              <w:t>{applicationDate}</w:t>
+              <w:t>{deviceClass}{/devices}</w:t>
             </w:r>
           </w:p>
         </w:tc>
@@ -465,247 +473,464 @@
     </w:tbl>
     <w:p>
       <w:pPr>
-        <w:keepNext w:val="0"/>
-        <w:keepLines w:val="0"/>
-        <w:spacing w:before="0" w:after="20" w:line="252" w:lineRule="auto"/>
+        <w:spacing w:before="0" w:after="140" w:line="259" w:lineRule="auto"/>
       </w:pPr>
+      <w:r>
+        <w:rPr>
+          <w:rFonts w:ascii="Times New Roman" w:hAnsi="Times New Roman" w:eastAsia="Times New Roman"/>
+          <w:b w:val="0"/>
+          <w:i w:val="0"/>
+          <w:sz w:val="22"/>
+        </w:rPr>
+        <w:t>The proposed classification is based on the intended use and characteristics of the investigational medical device, together with the applicable classification rule under the Medical Devices Rules, 2017.</w:t>
+      </w:r>
     </w:p>
     <w:p>
       <w:pPr>
-        <w:pStyle w:val="Heading1"/>
+        <w:spacing w:before="0" w:after="40" w:line="259" w:lineRule="auto"/>
       </w:pPr>
       <w:r>
+        <w:rPr>
+          <w:rFonts w:ascii="Times New Roman" w:hAnsi="Times New Roman" w:eastAsia="Times New Roman"/>
+          <w:b/>
+          <w:i w:val="0"/>
+          <w:sz w:val="23"/>
+        </w:rPr>
         <w:t>1. Device Description</w:t>
       </w:r>
     </w:p>
     <w:p>
       <w:pPr>
-        <w:keepNext w:val="0"/>
-        <w:keepLines/>
-        <w:spacing w:before="40" w:after="100" w:line="264" w:lineRule="auto"/>
-        <w:jc w:val="left"/>
+        <w:spacing w:before="0" w:after="40" w:line="259" w:lineRule="auto"/>
+        <w:ind w:left="72"/>
       </w:pPr>
       <w:r>
         <w:rPr>
-          <w:rFonts w:ascii="Times New Roman" w:hAnsi="Times New Roman" w:cs="Times New Roman"/>
+          <w:rFonts w:ascii="Times New Roman" w:hAnsi="Times New Roman" w:eastAsia="Times New Roman"/>
           <w:b w:val="0"/>
           <w:i w:val="0"/>
-          <w:vanish w:val="0"/>
-          <w:color w:val="000000"/>
-          <w:sz w:val="20"/>
+          <w:sz w:val="22"/>
         </w:rPr>
         <w:t>{deviceDescription}</w:t>
       </w:r>
     </w:p>
     <w:p>
       <w:pPr>
-        <w:pStyle w:val="Heading1"/>
+        <w:spacing w:before="0" w:after="60" w:line="259" w:lineRule="auto"/>
       </w:pPr>
       <w:r>
+        <w:rPr>
+          <w:rFonts w:ascii="Times New Roman" w:hAnsi="Times New Roman" w:eastAsia="Times New Roman"/>
+          <w:b w:val="0"/>
+          <w:i w:val="0"/>
+          <w:sz w:val="20"/>
+        </w:rPr>
+      </w:r>
+    </w:p>
+    <w:p>
+      <w:pPr>
+        <w:spacing w:before="0" w:after="40" w:line="259" w:lineRule="auto"/>
+      </w:pPr>
+      <w:r>
+        <w:rPr>
+          <w:rFonts w:ascii="Times New Roman" w:hAnsi="Times New Roman" w:eastAsia="Times New Roman"/>
+          <w:b/>
+          <w:i w:val="0"/>
+          <w:sz w:val="23"/>
+        </w:rPr>
         <w:t>2. Applicable Classification Rule</w:t>
       </w:r>
     </w:p>
     <w:p>
       <w:pPr>
-        <w:keepNext w:val="0"/>
-        <w:keepLines/>
-        <w:spacing w:before="40" w:after="100" w:line="264" w:lineRule="auto"/>
-        <w:jc w:val="left"/>
+        <w:spacing w:before="0" w:after="40" w:line="259" w:lineRule="auto"/>
+        <w:ind w:left="72"/>
       </w:pPr>
       <w:r>
         <w:rPr>
-          <w:rFonts w:ascii="Times New Roman" w:hAnsi="Times New Roman" w:cs="Times New Roman"/>
+          <w:rFonts w:ascii="Times New Roman" w:hAnsi="Times New Roman" w:eastAsia="Times New Roman"/>
           <w:b w:val="0"/>
           <w:i w:val="0"/>
-          <w:vanish w:val="0"/>
-          <w:color w:val="000000"/>
-          <w:sz w:val="20"/>
+          <w:sz w:val="22"/>
         </w:rPr>
         <w:t>{applicableClassificationRule}</w:t>
       </w:r>
     </w:p>
     <w:p>
       <w:pPr>
-        <w:pStyle w:val="Heading1"/>
+        <w:spacing w:before="0" w:after="60" w:line="259" w:lineRule="auto"/>
       </w:pPr>
       <w:r>
+        <w:rPr>
+          <w:rFonts w:ascii="Times New Roman" w:hAnsi="Times New Roman" w:eastAsia="Times New Roman"/>
+          <w:b w:val="0"/>
+          <w:i w:val="0"/>
+          <w:sz w:val="20"/>
+        </w:rPr>
+      </w:r>
+    </w:p>
+    <w:p>
+      <w:pPr>
+        <w:spacing w:before="0" w:after="40" w:line="259" w:lineRule="auto"/>
+      </w:pPr>
+      <w:r>
+        <w:rPr>
+          <w:rFonts w:ascii="Times New Roman" w:hAnsi="Times New Roman" w:eastAsia="Times New Roman"/>
+          <w:b/>
+          <w:i w:val="0"/>
+          <w:sz w:val="23"/>
+        </w:rPr>
         <w:t>3. Classification Factors</w:t>
       </w:r>
     </w:p>
     <w:p>
       <w:pPr>
-        <w:keepNext w:val="0"/>
-        <w:keepLines/>
-        <w:spacing w:before="40" w:after="100" w:line="264" w:lineRule="auto"/>
-        <w:jc w:val="left"/>
+        <w:spacing w:before="0" w:after="40" w:line="259" w:lineRule="auto"/>
+        <w:ind w:left="72"/>
       </w:pPr>
       <w:r>
         <w:rPr>
-          <w:rFonts w:ascii="Times New Roman" w:hAnsi="Times New Roman" w:cs="Times New Roman"/>
+          <w:rFonts w:ascii="Times New Roman" w:hAnsi="Times New Roman" w:eastAsia="Times New Roman"/>
           <w:b w:val="0"/>
           <w:i w:val="0"/>
-          <w:vanish w:val="0"/>
-          <w:color w:val="000000"/>
-          <w:sz w:val="20"/>
+          <w:sz w:val="22"/>
         </w:rPr>
         <w:t>{classificationFactors}</w:t>
       </w:r>
+    </w:p>
+    <w:p>
+      <w:pPr>
+        <w:spacing w:before="0" w:after="100" w:line="259" w:lineRule="auto"/>
+        <w:ind w:left="72"/>
+      </w:pPr>
       <w:r>
         <w:rPr>
-          <w:rFonts w:ascii="Times New Roman" w:hAnsi="Times New Roman" w:cs="Times New Roman"/>
+          <w:rFonts w:ascii="Times New Roman" w:hAnsi="Times New Roman" w:eastAsia="Times New Roman"/>
           <w:b w:val="0"/>
           <w:i/>
-          <w:vanish w:val="0"/>
-          <w:color w:val="666666"/>
-          <w:sz w:val="17"/>
+          <w:sz w:val="19"/>
         </w:rPr>
-        <w:br/>
         <w:t>Address invasiveness, duration of use, active/implantable characteristics, body-system contact and other applicable rule factors.</w:t>
       </w:r>
     </w:p>
     <w:p>
       <w:pPr>
-        <w:pStyle w:val="Heading1"/>
+        <w:spacing w:before="0" w:after="40" w:line="259" w:lineRule="auto"/>
       </w:pPr>
       <w:r>
+        <w:rPr>
+          <w:rFonts w:ascii="Times New Roman" w:hAnsi="Times New Roman" w:eastAsia="Times New Roman"/>
+          <w:b/>
+          <w:i w:val="0"/>
+          <w:sz w:val="23"/>
+        </w:rPr>
         <w:t>4. Justification for the Proposed Class</w:t>
       </w:r>
     </w:p>
     <w:p>
       <w:pPr>
-        <w:keepNext w:val="0"/>
-        <w:keepLines/>
-        <w:spacing w:before="40" w:after="100" w:line="264" w:lineRule="auto"/>
-        <w:jc w:val="left"/>
+        <w:spacing w:before="0" w:after="40" w:line="259" w:lineRule="auto"/>
+        <w:ind w:left="72"/>
       </w:pPr>
       <w:r>
         <w:rPr>
-          <w:rFonts w:ascii="Times New Roman" w:hAnsi="Times New Roman" w:cs="Times New Roman"/>
+          <w:rFonts w:ascii="Times New Roman" w:hAnsi="Times New Roman" w:eastAsia="Times New Roman"/>
           <w:b w:val="0"/>
           <w:i w:val="0"/>
-          <w:vanish w:val="0"/>
-          <w:color w:val="000000"/>
-          <w:sz w:val="20"/>
+          <w:sz w:val="22"/>
         </w:rPr>
         <w:t>{classificationJustification}</w:t>
       </w:r>
     </w:p>
     <w:p>
       <w:pPr>
-        <w:pStyle w:val="Heading1"/>
+        <w:spacing w:before="0" w:after="60" w:line="259" w:lineRule="auto"/>
       </w:pPr>
       <w:r>
+        <w:rPr>
+          <w:rFonts w:ascii="Times New Roman" w:hAnsi="Times New Roman" w:eastAsia="Times New Roman"/>
+          <w:b w:val="0"/>
+          <w:i w:val="0"/>
+          <w:sz w:val="20"/>
+        </w:rPr>
+      </w:r>
+    </w:p>
+    <w:p>
+      <w:pPr>
+        <w:spacing w:before="0" w:after="40" w:line="259" w:lineRule="auto"/>
+      </w:pPr>
+      <w:r>
+        <w:rPr>
+          <w:rFonts w:ascii="Times New Roman" w:hAnsi="Times New Roman" w:eastAsia="Times New Roman"/>
+          <w:b/>
+          <w:i w:val="0"/>
+          <w:sz w:val="23"/>
+        </w:rPr>
         <w:t>5. Supporting Evidence</w:t>
       </w:r>
     </w:p>
     <w:p>
       <w:pPr>
-        <w:keepNext w:val="0"/>
-        <w:keepLines/>
-        <w:spacing w:before="40" w:after="100" w:line="264" w:lineRule="auto"/>
-        <w:jc w:val="left"/>
+        <w:spacing w:before="0" w:after="40" w:line="259" w:lineRule="auto"/>
+        <w:ind w:left="72"/>
       </w:pPr>
       <w:r>
         <w:rPr>
-          <w:rFonts w:ascii="Times New Roman" w:hAnsi="Times New Roman" w:cs="Times New Roman"/>
+          <w:rFonts w:ascii="Times New Roman" w:hAnsi="Times New Roman" w:eastAsia="Times New Roman"/>
           <w:b w:val="0"/>
           <w:i w:val="0"/>
-          <w:vanish w:val="0"/>
-          <w:color w:val="000000"/>
-          <w:sz w:val="20"/>
+          <w:sz w:val="22"/>
         </w:rPr>
         <w:t>{classificationSupportingEvidence}</w:t>
       </w:r>
     </w:p>
     <w:p>
       <w:pPr>
-        <w:pStyle w:val="Heading1"/>
+        <w:spacing w:before="0" w:after="60" w:line="259" w:lineRule="auto"/>
       </w:pPr>
       <w:r>
+        <w:rPr>
+          <w:rFonts w:ascii="Times New Roman" w:hAnsi="Times New Roman" w:eastAsia="Times New Roman"/>
+          <w:b w:val="0"/>
+          <w:i w:val="0"/>
+          <w:sz w:val="20"/>
+        </w:rPr>
+      </w:r>
+    </w:p>
+    <w:p>
+      <w:pPr>
+        <w:spacing w:before="0" w:after="40" w:line="259" w:lineRule="auto"/>
+      </w:pPr>
+      <w:r>
+        <w:rPr>
+          <w:rFonts w:ascii="Times New Roman" w:hAnsi="Times New Roman" w:eastAsia="Times New Roman"/>
+          <w:b/>
+          <w:i w:val="0"/>
+          <w:sz w:val="23"/>
+        </w:rPr>
         <w:t>6. Conclusion</w:t>
       </w:r>
     </w:p>
     <w:p>
       <w:pPr>
-        <w:keepNext w:val="0"/>
-        <w:keepLines w:val="0"/>
-        <w:spacing w:before="0" w:after="240" w:line="269" w:lineRule="auto"/>
-        <w:jc w:val="left"/>
+        <w:spacing w:before="0" w:after="160" w:line="259" w:lineRule="auto"/>
       </w:pPr>
       <w:r>
         <w:rPr>
-          <w:rFonts w:ascii="Times New Roman" w:hAnsi="Times New Roman" w:cs="Times New Roman"/>
+          <w:rFonts w:ascii="Times New Roman" w:hAnsi="Times New Roman" w:eastAsia="Times New Roman"/>
           <w:b w:val="0"/>
           <w:i w:val="0"/>
-          <w:vanish w:val="0"/>
-          <w:color w:val="000000"/>
-          <w:sz w:val="21"/>
+          <w:sz w:val="22"/>
         </w:rPr>
         <w:t>Based on the intended use, device characteristics and the applicable classification rule stated above, {deviceGenericName} is proposed to be classified as Class {deviceClass} under the Medical Devices Rules, 2017.</w:t>
       </w:r>
     </w:p>
-    <w:p>
-      <w:pPr>
-        <w:keepNext/>
-        <w:keepLines w:val="0"/>
-        <w:spacing w:before="0" w:after="20" w:line="252" w:lineRule="auto"/>
-        <w:jc w:val="right"/>
-      </w:pPr>
-      <w:r>
-        <w:rPr>
-          <w:rFonts w:ascii="Times New Roman" w:hAnsi="Times New Roman" w:cs="Times New Roman"/>
-          <w:b w:val="0"/>
-          <w:i w:val="0"/>
-          <w:vanish w:val="0"/>
-          <w:color w:val="000000"/>
-          <w:sz w:val="19"/>
-        </w:rPr>
-        <w:t>Signature: ______________________________</w:t>
-      </w:r>
-    </w:p>
-    <w:p>
-      <w:pPr>
-        <w:keepNext/>
-        <w:keepLines w:val="0"/>
-        <w:spacing w:before="0" w:after="0" w:line="252" w:lineRule="auto"/>
-        <w:jc w:val="right"/>
-      </w:pPr>
-      <w:r>
-        <w:rPr>
-          <w:rFonts w:ascii="Times New Roman" w:hAnsi="Times New Roman" w:cs="Times New Roman"/>
-          <w:b/>
-          <w:i w:val="0"/>
-          <w:vanish w:val="0"/>
-          <w:color w:val="000000"/>
-          <w:sz w:val="19"/>
-        </w:rPr>
-        <w:t>{authorisedSignatoryName}</w:t>
-      </w:r>
-    </w:p>
-    <w:p>
-      <w:pPr>
-        <w:keepNext w:val="0"/>
-        <w:keepLines w:val="0"/>
-        <w:spacing w:before="0" w:after="0" w:line="252" w:lineRule="auto"/>
-        <w:jc w:val="right"/>
-      </w:pPr>
-      <w:r>
-        <w:rPr>
-          <w:rFonts w:ascii="Times New Roman" w:hAnsi="Times New Roman" w:cs="Times New Roman"/>
-          <w:b w:val="0"/>
-          <w:i w:val="0"/>
-          <w:vanish w:val="0"/>
-          <w:color w:val="000000"/>
-          <w:sz w:val="19"/>
-        </w:rPr>
-        <w:t>{authorisedSignatoryDesignation} | {applicantName}</w:t>
-      </w:r>
-    </w:p>
+    <w:tbl>
+      <w:tblPr>
+        <w:tblW w:type="auto" w:w="0"/>
+        <w:jc w:val="center"/>
+        <w:tblLayout w:type="fixed"/>
+        <w:tblLook w:firstColumn="1" w:firstRow="1" w:lastColumn="0" w:lastRow="0" w:noHBand="0" w:noVBand="1" w:val="04A0"/>
+        <w:tblBorders>
+          <w:top w:val="nil"/>
+          <w:left w:val="nil"/>
+          <w:bottom w:val="nil"/>
+          <w:right w:val="nil"/>
+          <w:insideH w:val="nil"/>
+          <w:insideV w:val="nil"/>
+        </w:tblBorders>
+      </w:tblPr>
+      <w:tblGrid>
+        <w:gridCol w:w="5328"/>
+        <w:gridCol w:w="5328"/>
+      </w:tblGrid>
+      <w:tr>
+        <w:tc>
+          <w:tcPr>
+            <w:tcW w:type="dxa" w:w="6336"/>
+            <w:vAlign w:val="center"/>
+          </w:tcPr>
+          <w:p>
+            <w:pPr>
+              <w:spacing w:after="0" w:line="240" w:lineRule="auto"/>
+              <w:jc w:val="left"/>
+            </w:pPr>
+            <w:r/>
+            <w:r>
+              <w:rPr>
+                <w:rFonts w:ascii="Times New Roman" w:hAnsi="Times New Roman" w:eastAsia="Times New Roman"/>
+                <w:b/>
+                <w:i w:val="0"/>
+                <w:sz w:val="21"/>
+              </w:rPr>
+              <w:t>For</w:t>
+            </w:r>
+          </w:p>
+        </w:tc>
+        <w:tc>
+          <w:tcPr>
+            <w:tcW w:type="dxa" w:w="6624"/>
+            <w:vAlign w:val="center"/>
+          </w:tcPr>
+          <w:p>
+            <w:pPr>
+              <w:spacing w:after="0" w:line="240" w:lineRule="auto"/>
+              <w:jc w:val="center"/>
+            </w:pPr>
+            <w:r/>
+            <w:r>
+              <w:rPr>
+                <w:rFonts w:ascii="Times New Roman" w:hAnsi="Times New Roman" w:eastAsia="Times New Roman"/>
+                <w:b/>
+                <w:i w:val="0"/>
+                <w:sz w:val="21"/>
+              </w:rPr>
+              <w:t>Signature: ______________________________</w:t>
+            </w:r>
+          </w:p>
+        </w:tc>
+      </w:tr>
+      <w:tr>
+        <w:tc>
+          <w:tcPr>
+            <w:tcW w:type="dxa" w:w="6336"/>
+            <w:vAlign w:val="center"/>
+          </w:tcPr>
+          <w:p>
+            <w:pPr>
+              <w:spacing w:after="0" w:line="240" w:lineRule="auto"/>
+              <w:jc w:val="left"/>
+            </w:pPr>
+            <w:r/>
+            <w:r>
+              <w:rPr>
+                <w:rFonts w:ascii="Times New Roman" w:hAnsi="Times New Roman" w:eastAsia="Times New Roman"/>
+                <w:b w:val="0"/>
+                <w:i w:val="0"/>
+                <w:sz w:val="21"/>
+              </w:rPr>
+              <w:t>{applicantName}</w:t>
+            </w:r>
+          </w:p>
+        </w:tc>
+        <w:tc>
+          <w:tcPr>
+            <w:tcW w:type="dxa" w:w="6624"/>
+            <w:vAlign w:val="center"/>
+          </w:tcPr>
+          <w:p>
+            <w:pPr>
+              <w:spacing w:after="0" w:line="240" w:lineRule="auto"/>
+              <w:jc w:val="center"/>
+            </w:pPr>
+            <w:r/>
+            <w:r>
+              <w:rPr>
+                <w:rFonts w:ascii="Times New Roman" w:hAnsi="Times New Roman" w:eastAsia="Times New Roman"/>
+                <w:b w:val="0"/>
+                <w:i w:val="0"/>
+                <w:sz w:val="21"/>
+              </w:rPr>
+              <w:t>{authorisedSignatoryName}</w:t>
+            </w:r>
+          </w:p>
+        </w:tc>
+      </w:tr>
+      <w:tr>
+        <w:tc>
+          <w:tcPr>
+            <w:tcW w:type="dxa" w:w="6336"/>
+            <w:vAlign w:val="center"/>
+          </w:tcPr>
+          <w:p>
+            <w:pPr>
+              <w:spacing w:after="0" w:line="240" w:lineRule="auto"/>
+              <w:jc w:val="left"/>
+            </w:pPr>
+            <w:r/>
+            <w:r>
+              <w:rPr>
+                <w:rFonts w:ascii="Times New Roman" w:hAnsi="Times New Roman" w:eastAsia="Times New Roman"/>
+                <w:b w:val="0"/>
+                <w:i w:val="0"/>
+                <w:sz w:val="21"/>
+              </w:rPr>
+            </w:r>
+          </w:p>
+        </w:tc>
+        <w:tc>
+          <w:tcPr>
+            <w:tcW w:type="dxa" w:w="6624"/>
+            <w:vAlign w:val="center"/>
+          </w:tcPr>
+          <w:p>
+            <w:pPr>
+              <w:spacing w:after="0" w:line="240" w:lineRule="auto"/>
+              <w:jc w:val="center"/>
+            </w:pPr>
+            <w:r/>
+            <w:r>
+              <w:rPr>
+                <w:rFonts w:ascii="Times New Roman" w:hAnsi="Times New Roman" w:eastAsia="Times New Roman"/>
+                <w:b w:val="0"/>
+                <w:i w:val="0"/>
+                <w:sz w:val="21"/>
+              </w:rPr>
+              <w:t>{authorisedSignatoryDesignation}</w:t>
+            </w:r>
+          </w:p>
+        </w:tc>
+      </w:tr>
+      <w:tr>
+        <w:tc>
+          <w:tcPr>
+            <w:tcW w:type="dxa" w:w="6336"/>
+            <w:vAlign w:val="center"/>
+          </w:tcPr>
+          <w:p>
+            <w:pPr>
+              <w:spacing w:after="0" w:line="240" w:lineRule="auto"/>
+              <w:jc w:val="left"/>
+            </w:pPr>
+            <w:r/>
+            <w:r>
+              <w:rPr>
+                <w:rFonts w:ascii="Times New Roman" w:hAnsi="Times New Roman" w:eastAsia="Times New Roman"/>
+                <w:b w:val="0"/>
+                <w:i w:val="0"/>
+                <w:sz w:val="21"/>
+              </w:rPr>
+            </w:r>
+          </w:p>
+        </w:tc>
+        <w:tc>
+          <w:tcPr>
+            <w:tcW w:type="dxa" w:w="6624"/>
+            <w:vAlign w:val="center"/>
+          </w:tcPr>
+          <w:p>
+            <w:pPr>
+              <w:spacing w:after="0" w:line="240" w:lineRule="auto"/>
+              <w:jc w:val="center"/>
+            </w:pPr>
+            <w:r/>
+            <w:r>
+              <w:rPr>
+                <w:rFonts w:ascii="Times New Roman" w:hAnsi="Times New Roman" w:eastAsia="Times New Roman"/>
+                <w:b w:val="0"/>
+                <w:i w:val="0"/>
+                <w:sz w:val="21"/>
+              </w:rPr>
+              <w:t>Date: {applicationDate}</w:t>
+            </w:r>
+          </w:p>
+        </w:tc>
+      </w:tr>
+    </w:tbl>
     <w:sectPr>
       <w:headerReference w:type="default" r:id="rId9"/>
-      <w:footerReference w:type="default" r:id="rId10"/>
-      <w:pgSz w:w="11906" w:h="16838"/>
-      <w:pgMar w:top="1440" w:right="1440" w:bottom="1247" w:left="1440" w:header="454" w:footer="454" w:gutter="0"/>
+      <w:pgSz w:w="12240" w:h="15840"/>
+      <w:pgMar w:top="792" w:right="792" w:bottom="792" w:left="792" w:header="720" w:footer="720" w:gutter="0"/>
       <w:cols w:space="720"/>
       <w:docGrid w:linePitch="360"/>
     </w:sectPr>
@@ -713,52 +938,21 @@
 </w:document>
 </file>
 
-<file path=word/footer1.xml><?xml version="1.0" encoding="utf-8"?>
-<w:ftr xmlns:m="http://schemas.openxmlformats.org/officeDocument/2006/math" xmlns:mc="http://schemas.openxmlformats.org/markup-compatibility/2006" xmlns:mo="http://schemas.microsoft.com/office/mac/office/2008/main" xmlns:mv="urn:schemas-microsoft-com:mac:vml" xmlns:o="urn:schemas-microsoft-com:office:office" xmlns:r="http://schemas.openxmlformats.org/officeDocument/2006/relationships" xmlns:v="urn:schemas-microsoft-com:vml" xmlns:w10="urn:schemas-microsoft-com:office:word" xmlns:w14="http://schemas.microsoft.com/office/word/2010/wordml" xmlns:w="http://schemas.openxmlformats.org/wordprocessingml/2006/main" xmlns:wne="http://schemas.microsoft.com/office/word/2006/wordml" xmlns:wp14="http://schemas.microsoft.com/office/word/2010/wordprocessingDrawing" xmlns:wp="http://schemas.openxmlformats.org/drawingml/2006/wordprocessingDrawing" xmlns:wpc="http://schemas.microsoft.com/office/word/2010/wordprocessingCanvas" xmlns:wpg="http://schemas.microsoft.com/office/word/2010/wordprocessingGroup" xmlns:wpi="http://schemas.microsoft.com/office/word/2010/wordprocessingInk" xmlns:wps="http://schemas.microsoft.com/office/word/2010/wordprocessingShape" mc:Ignorable="w14 wp14">
-  <w:p>
-    <w:pPr>
-      <w:pStyle w:val="Footer"/>
-      <w:spacing w:before="0" w:after="0"/>
-      <w:jc w:val="center"/>
-    </w:pPr>
-    <w:r>
-      <w:rPr>
-        <w:rFonts w:ascii="Times New Roman" w:hAnsi="Times New Roman" w:cs="Times New Roman"/>
-        <w:b w:val="0"/>
-        <w:i w:val="0"/>
-        <w:vanish w:val="0"/>
-        <w:color w:val="666666"/>
-        <w:sz w:val="17"/>
-      </w:rPr>
-      <w:t xml:space="preserve">Page </w:t>
-      <w:fldChar w:fldCharType="begin"/>
-      <w:instrText xml:space="preserve"> PAGE </w:instrText>
-      <w:fldChar w:fldCharType="separate"/>
-      <w:t>1</w:t>
-      <w:fldChar w:fldCharType="end"/>
-    </w:r>
-  </w:p>
-</w:ftr>
-</file>
-
 <file path=word/header1.xml><?xml version="1.0" encoding="utf-8"?>
 <w:hdr xmlns:m="http://schemas.openxmlformats.org/officeDocument/2006/math" xmlns:mc="http://schemas.openxmlformats.org/markup-compatibility/2006" xmlns:mo="http://schemas.microsoft.com/office/mac/office/2008/main" xmlns:mv="urn:schemas-microsoft-com:mac:vml" xmlns:o="urn:schemas-microsoft-com:office:office" xmlns:r="http://schemas.openxmlformats.org/officeDocument/2006/relationships" xmlns:v="urn:schemas-microsoft-com:vml" xmlns:w10="urn:schemas-microsoft-com:office:word" xmlns:w14="http://schemas.microsoft.com/office/word/2010/wordml" xmlns:w="http://schemas.openxmlformats.org/wordprocessingml/2006/main" xmlns:wne="http://schemas.microsoft.com/office/word/2006/wordml" xmlns:wp14="http://schemas.microsoft.com/office/word/2010/wordprocessingDrawing" xmlns:wp="http://schemas.openxmlformats.org/drawingml/2006/wordprocessingDrawing" xmlns:wpc="http://schemas.microsoft.com/office/word/2010/wordprocessingCanvas" xmlns:wpg="http://schemas.microsoft.com/office/word/2010/wordprocessingGroup" xmlns:wpi="http://schemas.microsoft.com/office/word/2010/wordprocessingInk" xmlns:wps="http://schemas.microsoft.com/office/word/2010/wordprocessingShape" mc:Ignorable="w14 wp14">
   <w:p>
     <w:pPr>
       <w:pStyle w:val="Header"/>
-      <w:spacing w:after="0"/>
-      <w:jc w:val="right"/>
+      <w:jc w:val="center"/>
     </w:pPr>
     <w:r>
       <w:rPr>
-        <w:rFonts w:ascii="Times New Roman" w:hAnsi="Times New Roman" w:cs="Times New Roman"/>
+        <w:rFonts w:ascii="Times New Roman" w:hAnsi="Times New Roman" w:eastAsia="Times New Roman"/>
         <w:b w:val="0"/>
         <w:i w:val="0"/>
-        <w:vanish w:val="0"/>
-        <w:color w:val="666666"/>
-        <w:sz w:val="16"/>
-      </w:rPr>
-      <w:t>MD-22 Clinical Investigation Dossier</w:t>
+        <w:sz w:val="17"/>
+      </w:rPr>
+      <w:t>MD-22 Device Classification Justification</w:t>
     </w:r>
   </w:p>
 </w:hdr>
@@ -1128,13 +1322,11 @@
     <w:qFormat/>
     <w:rsid w:val="00FC693F"/>
     <w:pPr>
-      <w:spacing w:before="0" w:after="80" w:line="259" w:lineRule="auto"/>
+      <w:spacing w:after="0" w:line="259" w:lineRule="auto"/>
     </w:pPr>
     <w:rPr>
-      <w:rFonts w:ascii="Times New Roman" w:hAnsi="Times New Roman" w:cs="Times New Roman"/>
-      <w:b w:val="0"/>
-      <w:color w:val="000000"/>
-      <w:sz w:val="21"/>
+      <w:rFonts w:ascii="Times New Roman" w:hAnsi="Times New Roman" w:eastAsia="Times New Roman"/>
+      <w:sz w:val="22"/>
     </w:rPr>
   </w:style>
   <w:style w:type="paragraph" w:styleId="Header">
@@ -1192,15 +1384,15 @@
     <w:pPr>
       <w:keepNext/>
       <w:keepLines/>
-      <w:spacing w:before="240" w:after="100"/>
+      <w:spacing w:before="480" w:after="0"/>
       <w:outlineLvl w:val="0"/>
     </w:pPr>
     <w:rPr>
-      <w:rFonts w:asciiTheme="majorHAnsi" w:eastAsiaTheme="majorEastAsia" w:hAnsiTheme="majorHAnsi" w:cstheme="majorBidi" w:ascii="Times New Roman" w:hAnsi="Times New Roman" w:cs="Times New Roman"/>
+      <w:rFonts w:asciiTheme="majorHAnsi" w:eastAsiaTheme="majorEastAsia" w:hAnsiTheme="majorHAnsi" w:cstheme="majorBidi"/>
       <w:b/>
       <w:bCs/>
-      <w:color w:val="000000"/>
-      <w:sz w:val="26"/>
+      <w:color w:val="365F91" w:themeColor="accent1" w:themeShade="BF"/>
+      <w:sz w:val="28"/>
       <w:szCs w:val="28"/>
     </w:rPr>
   </w:style>
@@ -1216,15 +1408,15 @@
     <w:pPr>
       <w:keepNext/>
       <w:keepLines/>
-      <w:spacing w:before="180" w:after="80"/>
+      <w:spacing w:before="200" w:after="0"/>
       <w:outlineLvl w:val="1"/>
     </w:pPr>
     <w:rPr>
-      <w:rFonts w:asciiTheme="majorHAnsi" w:eastAsiaTheme="majorEastAsia" w:hAnsiTheme="majorHAnsi" w:cstheme="majorBidi" w:ascii="Times New Roman" w:hAnsi="Times New Roman" w:cs="Times New Roman"/>
+      <w:rFonts w:asciiTheme="majorHAnsi" w:eastAsiaTheme="majorEastAsia" w:hAnsiTheme="majorHAnsi" w:cstheme="majorBidi"/>
       <w:b/>
       <w:bCs/>
-      <w:color w:val="000000"/>
-      <w:sz w:val="23"/>
+      <w:color w:val="4F81BD" w:themeColor="accent1"/>
+      <w:sz w:val="26"/>
       <w:szCs w:val="26"/>
     </w:rPr>
   </w:style>
@@ -1240,15 +1432,14 @@
     <w:pPr>
       <w:keepNext/>
       <w:keepLines/>
-      <w:spacing w:before="140" w:after="60"/>
+      <w:spacing w:before="200" w:after="0"/>
       <w:outlineLvl w:val="2"/>
     </w:pPr>
     <w:rPr>
-      <w:rFonts w:asciiTheme="majorHAnsi" w:eastAsiaTheme="majorEastAsia" w:hAnsiTheme="majorHAnsi" w:cstheme="majorBidi" w:ascii="Times New Roman" w:hAnsi="Times New Roman" w:cs="Times New Roman"/>
+      <w:rFonts w:asciiTheme="majorHAnsi" w:eastAsiaTheme="majorEastAsia" w:hAnsiTheme="majorHAnsi" w:cstheme="majorBidi"/>
       <w:b/>
       <w:bCs/>
-      <w:color w:val="000000"/>
-      <w:sz w:val="21"/>
+      <w:color w:val="4F81BD" w:themeColor="accent1"/>
     </w:rPr>
   </w:style>
   <w:style w:type="paragraph" w:styleId="Heading4">

</xml_diff>